<commit_message>
Update DeepSeek agent and scheduling workflow
</commit_message>
<xml_diff>
--- a/课程提交文档/最终提交版/02_需求规格说明书.docx
+++ b/课程提交文档/最终提交版/02_需求规格说明书.docx
@@ -19,302 +19,1929 @@
         <w:t>三、需求规格说明书</w:t>
       </w:r>
     </w:p>
-    <w:p/>
+    <w:p>
+      <w:pPr>
+        <w:rPr>
+          <w:rFonts w:hint="eastAsia"/>
+          <w:sz w:val="52"/>
+        </w:rPr>
+      </w:pPr>
+    </w:p>
     <w:p>
       <w:pPr>
         <w:pStyle w:val="13"/>
-        <w:spacing w:line="276" w:lineRule="auto" w:after="0"/>
-        <w:ind w:firstLine="0"/>
+        <w:tabs>
+          <w:tab w:val="right" w:leader="dot" w:pos="8296"/>
+        </w:tabs>
+        <w:rPr>
+          <w:rFonts w:ascii="Calibri" w:hAnsi="Calibri"/>
+          <w:szCs w:val="22"/>
+          <w:lang/>
+        </w:rPr>
       </w:pPr>
       <w:r>
-        <w:rPr>
-          <w:rFonts w:ascii="Times New Roman" w:hAnsi="Times New Roman" w:eastAsia="宋体"/>
-          <w:sz w:val="21"/>
-        </w:rPr>
-        <w:t>1．引言</w:t>
+        <w:fldChar w:fldCharType="begin"/>
+      </w:r>
+      <w:r>
+        <w:instrText xml:space="preserve"> TOC \o "1-3" \h \z </w:instrText>
+      </w:r>
+      <w:r>
+        <w:fldChar w:fldCharType="separate"/>
+      </w:r>
+      <w:r>
+        <w:rPr>
+          <w:rStyle w:val="20"/>
+          <w:lang/>
+        </w:rPr>
+        <w:fldChar w:fldCharType="begin"/>
+      </w:r>
+      <w:r>
+        <w:rPr>
+          <w:rStyle w:val="20"/>
+          <w:lang/>
+        </w:rPr>
+        <w:instrText xml:space="preserve"> </w:instrText>
+      </w:r>
+      <w:r>
+        <w:rPr>
+          <w:lang/>
+        </w:rPr>
+        <w:instrText xml:space="preserve">HYPERLINK \l "_Toc434320463"</w:instrText>
+      </w:r>
+      <w:r>
+        <w:rPr>
+          <w:rStyle w:val="20"/>
+          <w:lang/>
+        </w:rPr>
+        <w:instrText xml:space="preserve"> </w:instrText>
+      </w:r>
+      <w:r>
+        <w:rPr>
+          <w:rStyle w:val="20"/>
+          <w:lang/>
+        </w:rPr>
+        <w:fldChar w:fldCharType="separate"/>
+      </w:r>
+      <w:r>
+        <w:rPr>
+          <w:rStyle w:val="20"/>
+          <w:lang/>
+        </w:rPr>
+        <w:t>1</w:t>
+      </w:r>
+      <w:r>
+        <w:rPr>
+          <w:rStyle w:val="20"/>
+          <w:rFonts w:hint="eastAsia"/>
+          <w:lang/>
+        </w:rPr>
+        <w:t>．引言</w:t>
+      </w:r>
+      <w:r>
+        <w:rPr>
+          <w:lang/>
+        </w:rPr>
         <w:tab/>
-        <w:t>2</w:t>
+      </w:r>
+      <w:r>
+        <w:rPr>
+          <w:lang/>
+        </w:rPr>
+        <w:fldChar w:fldCharType="begin"/>
+      </w:r>
+      <w:r>
+        <w:rPr>
+          <w:lang/>
+        </w:rPr>
+        <w:instrText xml:space="preserve"> PAGEREF _Toc434320463 \h </w:instrText>
+      </w:r>
+      <w:r>
+        <w:rPr>
+          <w:lang/>
+        </w:rPr>
+        <w:fldChar w:fldCharType="separate"/>
+      </w:r>
+      <w:r>
+        <w:rPr>
+          <w:lang/>
+        </w:rPr>
+        <w:t>1</w:t>
+      </w:r>
+      <w:r>
+        <w:rPr>
+          <w:lang/>
+        </w:rPr>
+        <w:fldChar w:fldCharType="end"/>
+      </w:r>
+      <w:r>
+        <w:rPr>
+          <w:rStyle w:val="20"/>
+          <w:lang/>
+        </w:rPr>
+        <w:fldChar w:fldCharType="end"/>
       </w:r>
     </w:p>
     <w:p>
       <w:pPr>
         <w:pStyle w:val="16"/>
-        <w:spacing w:line="276" w:lineRule="auto" w:after="0"/>
-        <w:ind w:firstLine="0"/>
+        <w:tabs>
+          <w:tab w:val="right" w:leader="dot" w:pos="8296"/>
+        </w:tabs>
+        <w:rPr>
+          <w:rFonts w:ascii="Calibri" w:hAnsi="Calibri"/>
+          <w:szCs w:val="22"/>
+          <w:lang/>
+        </w:rPr>
       </w:pPr>
       <w:r>
         <w:rPr>
-          <w:rFonts w:ascii="Times New Roman" w:hAnsi="Times New Roman" w:eastAsia="宋体"/>
-          <w:sz w:val="21"/>
-        </w:rPr>
-        <w:t>1.1编写目的</w:t>
+          <w:rStyle w:val="20"/>
+          <w:lang/>
+        </w:rPr>
+        <w:fldChar w:fldCharType="begin"/>
+      </w:r>
+      <w:r>
+        <w:rPr>
+          <w:rStyle w:val="20"/>
+          <w:lang/>
+        </w:rPr>
+        <w:instrText xml:space="preserve"> </w:instrText>
+      </w:r>
+      <w:r>
+        <w:rPr>
+          <w:lang/>
+        </w:rPr>
+        <w:instrText xml:space="preserve">HYPERLINK \l "_Toc434320464"</w:instrText>
+      </w:r>
+      <w:r>
+        <w:rPr>
+          <w:rStyle w:val="20"/>
+          <w:lang/>
+        </w:rPr>
+        <w:instrText xml:space="preserve"> </w:instrText>
+      </w:r>
+      <w:r>
+        <w:rPr>
+          <w:rStyle w:val="20"/>
+          <w:lang/>
+        </w:rPr>
+        <w:fldChar w:fldCharType="separate"/>
+      </w:r>
+      <w:r>
+        <w:rPr>
+          <w:rStyle w:val="20"/>
+          <w:lang/>
+        </w:rPr>
+        <w:t>1.1</w:t>
+      </w:r>
+      <w:r>
+        <w:rPr>
+          <w:rStyle w:val="20"/>
+          <w:rFonts w:hint="eastAsia"/>
+          <w:lang/>
+        </w:rPr>
+        <w:t>编写目的</w:t>
+      </w:r>
+      <w:r>
+        <w:rPr>
+          <w:lang/>
+        </w:rPr>
         <w:tab/>
-        <w:t>2</w:t>
+      </w:r>
+      <w:r>
+        <w:rPr>
+          <w:lang/>
+        </w:rPr>
+        <w:fldChar w:fldCharType="begin"/>
+      </w:r>
+      <w:r>
+        <w:rPr>
+          <w:lang/>
+        </w:rPr>
+        <w:instrText xml:space="preserve"> PAGEREF _Toc434320464 \h </w:instrText>
+      </w:r>
+      <w:r>
+        <w:rPr>
+          <w:lang/>
+        </w:rPr>
+        <w:fldChar w:fldCharType="separate"/>
+      </w:r>
+      <w:r>
+        <w:rPr>
+          <w:lang/>
+        </w:rPr>
+        <w:t>1</w:t>
+      </w:r>
+      <w:r>
+        <w:rPr>
+          <w:lang/>
+        </w:rPr>
+        <w:fldChar w:fldCharType="end"/>
+      </w:r>
+      <w:r>
+        <w:rPr>
+          <w:rStyle w:val="20"/>
+          <w:lang/>
+        </w:rPr>
+        <w:fldChar w:fldCharType="end"/>
       </w:r>
     </w:p>
     <w:p>
       <w:pPr>
         <w:pStyle w:val="16"/>
-        <w:spacing w:line="276" w:lineRule="auto" w:after="0"/>
-        <w:ind w:firstLine="0"/>
+        <w:tabs>
+          <w:tab w:val="right" w:leader="dot" w:pos="8296"/>
+        </w:tabs>
+        <w:rPr>
+          <w:rFonts w:ascii="Calibri" w:hAnsi="Calibri"/>
+          <w:szCs w:val="22"/>
+          <w:lang/>
+        </w:rPr>
       </w:pPr>
       <w:r>
         <w:rPr>
-          <w:rFonts w:ascii="Times New Roman" w:hAnsi="Times New Roman" w:eastAsia="宋体"/>
-          <w:sz w:val="21"/>
-        </w:rPr>
-        <w:t>1.2项目背景</w:t>
+          <w:rStyle w:val="20"/>
+          <w:lang/>
+        </w:rPr>
+        <w:fldChar w:fldCharType="begin"/>
+      </w:r>
+      <w:r>
+        <w:rPr>
+          <w:rStyle w:val="20"/>
+          <w:lang/>
+        </w:rPr>
+        <w:instrText xml:space="preserve"> </w:instrText>
+      </w:r>
+      <w:r>
+        <w:rPr>
+          <w:lang/>
+        </w:rPr>
+        <w:instrText xml:space="preserve">HYPERLINK \l "_Toc434320465"</w:instrText>
+      </w:r>
+      <w:r>
+        <w:rPr>
+          <w:rStyle w:val="20"/>
+          <w:lang/>
+        </w:rPr>
+        <w:instrText xml:space="preserve"> </w:instrText>
+      </w:r>
+      <w:r>
+        <w:rPr>
+          <w:rStyle w:val="20"/>
+          <w:lang/>
+        </w:rPr>
+        <w:fldChar w:fldCharType="separate"/>
+      </w:r>
+      <w:r>
+        <w:rPr>
+          <w:rStyle w:val="20"/>
+          <w:lang/>
+        </w:rPr>
+        <w:t>1.2</w:t>
+      </w:r>
+      <w:r>
+        <w:rPr>
+          <w:rStyle w:val="20"/>
+          <w:rFonts w:hint="eastAsia"/>
+          <w:lang/>
+        </w:rPr>
+        <w:t>项目背景</w:t>
+      </w:r>
+      <w:r>
+        <w:rPr>
+          <w:lang/>
+        </w:rPr>
         <w:tab/>
-        <w:t>3</w:t>
+      </w:r>
+      <w:r>
+        <w:rPr>
+          <w:lang/>
+        </w:rPr>
+        <w:fldChar w:fldCharType="begin"/>
+      </w:r>
+      <w:r>
+        <w:rPr>
+          <w:lang/>
+        </w:rPr>
+        <w:instrText xml:space="preserve"> PAGEREF _Toc434320465 \h </w:instrText>
+      </w:r>
+      <w:r>
+        <w:rPr>
+          <w:lang/>
+        </w:rPr>
+        <w:fldChar w:fldCharType="separate"/>
+      </w:r>
+      <w:r>
+        <w:rPr>
+          <w:lang/>
+        </w:rPr>
+        <w:t>1</w:t>
+      </w:r>
+      <w:r>
+        <w:rPr>
+          <w:lang/>
+        </w:rPr>
+        <w:fldChar w:fldCharType="end"/>
+      </w:r>
+      <w:r>
+        <w:rPr>
+          <w:rStyle w:val="20"/>
+          <w:lang/>
+        </w:rPr>
+        <w:fldChar w:fldCharType="end"/>
       </w:r>
     </w:p>
     <w:p>
       <w:pPr>
         <w:pStyle w:val="16"/>
-        <w:spacing w:line="276" w:lineRule="auto" w:after="0"/>
-        <w:ind w:firstLine="0"/>
+        <w:tabs>
+          <w:tab w:val="right" w:leader="dot" w:pos="8296"/>
+        </w:tabs>
+        <w:rPr>
+          <w:rFonts w:ascii="Calibri" w:hAnsi="Calibri"/>
+          <w:szCs w:val="22"/>
+          <w:lang/>
+        </w:rPr>
       </w:pPr>
       <w:r>
         <w:rPr>
-          <w:rFonts w:ascii="Times New Roman" w:hAnsi="Times New Roman" w:eastAsia="宋体"/>
-          <w:sz w:val="21"/>
-        </w:rPr>
-        <w:t>1.3定义</w:t>
+          <w:rStyle w:val="20"/>
+          <w:lang/>
+        </w:rPr>
+        <w:fldChar w:fldCharType="begin"/>
+      </w:r>
+      <w:r>
+        <w:rPr>
+          <w:rStyle w:val="20"/>
+          <w:lang/>
+        </w:rPr>
+        <w:instrText xml:space="preserve"> </w:instrText>
+      </w:r>
+      <w:r>
+        <w:rPr>
+          <w:lang/>
+        </w:rPr>
+        <w:instrText xml:space="preserve">HYPERLINK \l "_Toc434320466"</w:instrText>
+      </w:r>
+      <w:r>
+        <w:rPr>
+          <w:rStyle w:val="20"/>
+          <w:lang/>
+        </w:rPr>
+        <w:instrText xml:space="preserve"> </w:instrText>
+      </w:r>
+      <w:r>
+        <w:rPr>
+          <w:rStyle w:val="20"/>
+          <w:lang/>
+        </w:rPr>
+        <w:fldChar w:fldCharType="separate"/>
+      </w:r>
+      <w:r>
+        <w:rPr>
+          <w:rStyle w:val="20"/>
+          <w:lang/>
+        </w:rPr>
+        <w:t>1.3</w:t>
+      </w:r>
+      <w:r>
+        <w:rPr>
+          <w:rStyle w:val="20"/>
+          <w:rFonts w:hint="eastAsia"/>
+          <w:lang/>
+        </w:rPr>
+        <w:t>定义</w:t>
+      </w:r>
+      <w:r>
+        <w:rPr>
+          <w:lang/>
+        </w:rPr>
         <w:tab/>
-        <w:t>3</w:t>
+      </w:r>
+      <w:r>
+        <w:rPr>
+          <w:lang/>
+        </w:rPr>
+        <w:fldChar w:fldCharType="begin"/>
+      </w:r>
+      <w:r>
+        <w:rPr>
+          <w:lang/>
+        </w:rPr>
+        <w:instrText xml:space="preserve"> PAGEREF _Toc434320466 \h </w:instrText>
+      </w:r>
+      <w:r>
+        <w:rPr>
+          <w:lang/>
+        </w:rPr>
+        <w:fldChar w:fldCharType="separate"/>
+      </w:r>
+      <w:r>
+        <w:rPr>
+          <w:lang/>
+        </w:rPr>
+        <w:t>2</w:t>
+      </w:r>
+      <w:r>
+        <w:rPr>
+          <w:lang/>
+        </w:rPr>
+        <w:fldChar w:fldCharType="end"/>
+      </w:r>
+      <w:r>
+        <w:rPr>
+          <w:rStyle w:val="20"/>
+          <w:lang/>
+        </w:rPr>
+        <w:fldChar w:fldCharType="end"/>
       </w:r>
     </w:p>
     <w:p>
       <w:pPr>
         <w:pStyle w:val="16"/>
-        <w:spacing w:line="276" w:lineRule="auto" w:after="0"/>
-        <w:ind w:firstLine="0"/>
+        <w:tabs>
+          <w:tab w:val="right" w:leader="dot" w:pos="8296"/>
+        </w:tabs>
+        <w:rPr>
+          <w:rFonts w:ascii="Calibri" w:hAnsi="Calibri"/>
+          <w:szCs w:val="22"/>
+          <w:lang/>
+        </w:rPr>
       </w:pPr>
       <w:r>
         <w:rPr>
-          <w:rFonts w:ascii="Times New Roman" w:hAnsi="Times New Roman" w:eastAsia="宋体"/>
-          <w:sz w:val="21"/>
-        </w:rPr>
-        <w:t>1.4参考资料</w:t>
+          <w:rStyle w:val="20"/>
+          <w:lang/>
+        </w:rPr>
+        <w:fldChar w:fldCharType="begin"/>
+      </w:r>
+      <w:r>
+        <w:rPr>
+          <w:rStyle w:val="20"/>
+          <w:lang/>
+        </w:rPr>
+        <w:instrText xml:space="preserve"> </w:instrText>
+      </w:r>
+      <w:r>
+        <w:rPr>
+          <w:lang/>
+        </w:rPr>
+        <w:instrText xml:space="preserve">HYPERLINK \l "_Toc434320467"</w:instrText>
+      </w:r>
+      <w:r>
+        <w:rPr>
+          <w:rStyle w:val="20"/>
+          <w:lang/>
+        </w:rPr>
+        <w:instrText xml:space="preserve"> </w:instrText>
+      </w:r>
+      <w:r>
+        <w:rPr>
+          <w:rStyle w:val="20"/>
+          <w:lang/>
+        </w:rPr>
+        <w:fldChar w:fldCharType="separate"/>
+      </w:r>
+      <w:r>
+        <w:rPr>
+          <w:rStyle w:val="20"/>
+          <w:lang/>
+        </w:rPr>
+        <w:t>1.4</w:t>
+      </w:r>
+      <w:r>
+        <w:rPr>
+          <w:rStyle w:val="20"/>
+          <w:rFonts w:hint="eastAsia"/>
+          <w:lang/>
+        </w:rPr>
+        <w:t>参考资料</w:t>
+      </w:r>
+      <w:r>
+        <w:rPr>
+          <w:lang/>
+        </w:rPr>
         <w:tab/>
-        <w:t>4</w:t>
+      </w:r>
+      <w:r>
+        <w:rPr>
+          <w:lang/>
+        </w:rPr>
+        <w:fldChar w:fldCharType="begin"/>
+      </w:r>
+      <w:r>
+        <w:rPr>
+          <w:lang/>
+        </w:rPr>
+        <w:instrText xml:space="preserve"> PAGEREF _Toc434320467 \h </w:instrText>
+      </w:r>
+      <w:r>
+        <w:rPr>
+          <w:lang/>
+        </w:rPr>
+        <w:fldChar w:fldCharType="separate"/>
+      </w:r>
+      <w:r>
+        <w:rPr>
+          <w:lang/>
+        </w:rPr>
+        <w:t>2</w:t>
+      </w:r>
+      <w:r>
+        <w:rPr>
+          <w:lang/>
+        </w:rPr>
+        <w:fldChar w:fldCharType="end"/>
+      </w:r>
+      <w:r>
+        <w:rPr>
+          <w:rStyle w:val="20"/>
+          <w:lang/>
+        </w:rPr>
+        <w:fldChar w:fldCharType="end"/>
       </w:r>
     </w:p>
     <w:p>
       <w:pPr>
         <w:pStyle w:val="13"/>
-        <w:spacing w:line="276" w:lineRule="auto" w:after="0"/>
-        <w:ind w:firstLine="0"/>
+        <w:tabs>
+          <w:tab w:val="right" w:leader="dot" w:pos="8296"/>
+        </w:tabs>
+        <w:rPr>
+          <w:rFonts w:ascii="Calibri" w:hAnsi="Calibri"/>
+          <w:szCs w:val="22"/>
+          <w:lang/>
+        </w:rPr>
       </w:pPr>
       <w:r>
         <w:rPr>
-          <w:rFonts w:ascii="Times New Roman" w:hAnsi="Times New Roman" w:eastAsia="宋体"/>
-          <w:sz w:val="21"/>
-        </w:rPr>
-        <w:t>2．需求概述</w:t>
+          <w:rStyle w:val="20"/>
+          <w:lang/>
+        </w:rPr>
+        <w:fldChar w:fldCharType="begin"/>
+      </w:r>
+      <w:r>
+        <w:rPr>
+          <w:rStyle w:val="20"/>
+          <w:lang/>
+        </w:rPr>
+        <w:instrText xml:space="preserve"> </w:instrText>
+      </w:r>
+      <w:r>
+        <w:rPr>
+          <w:lang/>
+        </w:rPr>
+        <w:instrText xml:space="preserve">HYPERLINK \l "_Toc434320468"</w:instrText>
+      </w:r>
+      <w:r>
+        <w:rPr>
+          <w:rStyle w:val="20"/>
+          <w:lang/>
+        </w:rPr>
+        <w:instrText xml:space="preserve"> </w:instrText>
+      </w:r>
+      <w:r>
+        <w:rPr>
+          <w:rStyle w:val="20"/>
+          <w:lang/>
+        </w:rPr>
+        <w:fldChar w:fldCharType="separate"/>
+      </w:r>
+      <w:r>
+        <w:rPr>
+          <w:rStyle w:val="20"/>
+          <w:lang/>
+        </w:rPr>
+        <w:t>2</w:t>
+      </w:r>
+      <w:r>
+        <w:rPr>
+          <w:rStyle w:val="20"/>
+          <w:rFonts w:hint="eastAsia"/>
+          <w:lang/>
+        </w:rPr>
+        <w:t>．需求概述</w:t>
+      </w:r>
+      <w:r>
+        <w:rPr>
+          <w:lang/>
+        </w:rPr>
         <w:tab/>
-        <w:t>5</w:t>
+      </w:r>
+      <w:r>
+        <w:rPr>
+          <w:lang/>
+        </w:rPr>
+        <w:fldChar w:fldCharType="begin"/>
+      </w:r>
+      <w:r>
+        <w:rPr>
+          <w:lang/>
+        </w:rPr>
+        <w:instrText xml:space="preserve"> PAGEREF _Toc434320468 \h </w:instrText>
+      </w:r>
+      <w:r>
+        <w:rPr>
+          <w:lang/>
+        </w:rPr>
+        <w:fldChar w:fldCharType="separate"/>
+      </w:r>
+      <w:r>
+        <w:rPr>
+          <w:lang/>
+        </w:rPr>
+        <w:t>2</w:t>
+      </w:r>
+      <w:r>
+        <w:rPr>
+          <w:lang/>
+        </w:rPr>
+        <w:fldChar w:fldCharType="end"/>
+      </w:r>
+      <w:r>
+        <w:rPr>
+          <w:rStyle w:val="20"/>
+          <w:lang/>
+        </w:rPr>
+        <w:fldChar w:fldCharType="end"/>
       </w:r>
     </w:p>
     <w:p>
       <w:pPr>
         <w:pStyle w:val="16"/>
-        <w:spacing w:line="276" w:lineRule="auto" w:after="0"/>
-        <w:ind w:firstLine="0"/>
+        <w:tabs>
+          <w:tab w:val="right" w:leader="dot" w:pos="8296"/>
+        </w:tabs>
+        <w:rPr>
+          <w:rFonts w:ascii="Calibri" w:hAnsi="Calibri"/>
+          <w:szCs w:val="22"/>
+          <w:lang/>
+        </w:rPr>
       </w:pPr>
       <w:r>
         <w:rPr>
-          <w:rFonts w:ascii="Times New Roman" w:hAnsi="Times New Roman" w:eastAsia="宋体"/>
-          <w:sz w:val="21"/>
-        </w:rPr>
-        <w:t>2.1目标</w:t>
+          <w:rStyle w:val="20"/>
+          <w:lang/>
+        </w:rPr>
+        <w:fldChar w:fldCharType="begin"/>
+      </w:r>
+      <w:r>
+        <w:rPr>
+          <w:rStyle w:val="20"/>
+          <w:lang/>
+        </w:rPr>
+        <w:instrText xml:space="preserve"> </w:instrText>
+      </w:r>
+      <w:r>
+        <w:rPr>
+          <w:lang/>
+        </w:rPr>
+        <w:instrText xml:space="preserve">HYPERLINK \l "_Toc434320469"</w:instrText>
+      </w:r>
+      <w:r>
+        <w:rPr>
+          <w:rStyle w:val="20"/>
+          <w:lang/>
+        </w:rPr>
+        <w:instrText xml:space="preserve"> </w:instrText>
+      </w:r>
+      <w:r>
+        <w:rPr>
+          <w:rStyle w:val="20"/>
+          <w:lang/>
+        </w:rPr>
+        <w:fldChar w:fldCharType="separate"/>
+      </w:r>
+      <w:r>
+        <w:rPr>
+          <w:rStyle w:val="20"/>
+          <w:lang/>
+        </w:rPr>
+        <w:t>2.1</w:t>
+      </w:r>
+      <w:r>
+        <w:rPr>
+          <w:rStyle w:val="20"/>
+          <w:rFonts w:hint="eastAsia"/>
+          <w:lang/>
+        </w:rPr>
+        <w:t>目标</w:t>
+      </w:r>
+      <w:r>
+        <w:rPr>
+          <w:lang/>
+        </w:rPr>
         <w:tab/>
-        <w:t>5</w:t>
+      </w:r>
+      <w:r>
+        <w:rPr>
+          <w:lang/>
+        </w:rPr>
+        <w:fldChar w:fldCharType="begin"/>
+      </w:r>
+      <w:r>
+        <w:rPr>
+          <w:lang/>
+        </w:rPr>
+        <w:instrText xml:space="preserve"> PAGEREF _Toc434320469 \h </w:instrText>
+      </w:r>
+      <w:r>
+        <w:rPr>
+          <w:lang/>
+        </w:rPr>
+        <w:fldChar w:fldCharType="separate"/>
+      </w:r>
+      <w:r>
+        <w:rPr>
+          <w:lang/>
+        </w:rPr>
+        <w:t>2</w:t>
+      </w:r>
+      <w:r>
+        <w:rPr>
+          <w:lang/>
+        </w:rPr>
+        <w:fldChar w:fldCharType="end"/>
+      </w:r>
+      <w:r>
+        <w:rPr>
+          <w:rStyle w:val="20"/>
+          <w:lang/>
+        </w:rPr>
+        <w:fldChar w:fldCharType="end"/>
       </w:r>
     </w:p>
     <w:p>
       <w:pPr>
         <w:pStyle w:val="16"/>
-        <w:spacing w:line="276" w:lineRule="auto" w:after="0"/>
-        <w:ind w:firstLine="0"/>
+        <w:tabs>
+          <w:tab w:val="right" w:leader="dot" w:pos="8296"/>
+        </w:tabs>
+        <w:rPr>
+          <w:rFonts w:ascii="Calibri" w:hAnsi="Calibri"/>
+          <w:szCs w:val="22"/>
+          <w:lang/>
+        </w:rPr>
       </w:pPr>
       <w:r>
         <w:rPr>
-          <w:rFonts w:ascii="Times New Roman" w:hAnsi="Times New Roman" w:eastAsia="宋体"/>
-          <w:sz w:val="21"/>
-        </w:rPr>
-        <w:t>2.2运行环境</w:t>
+          <w:rStyle w:val="20"/>
+          <w:lang/>
+        </w:rPr>
+        <w:fldChar w:fldCharType="begin"/>
+      </w:r>
+      <w:r>
+        <w:rPr>
+          <w:rStyle w:val="20"/>
+          <w:lang/>
+        </w:rPr>
+        <w:instrText xml:space="preserve"> </w:instrText>
+      </w:r>
+      <w:r>
+        <w:rPr>
+          <w:lang/>
+        </w:rPr>
+        <w:instrText xml:space="preserve">HYPERLINK \l "_Toc434320470"</w:instrText>
+      </w:r>
+      <w:r>
+        <w:rPr>
+          <w:rStyle w:val="20"/>
+          <w:lang/>
+        </w:rPr>
+        <w:instrText xml:space="preserve"> </w:instrText>
+      </w:r>
+      <w:r>
+        <w:rPr>
+          <w:rStyle w:val="20"/>
+          <w:lang/>
+        </w:rPr>
+        <w:fldChar w:fldCharType="separate"/>
+      </w:r>
+      <w:r>
+        <w:rPr>
+          <w:rStyle w:val="20"/>
+          <w:lang/>
+        </w:rPr>
+        <w:t>2.2</w:t>
+      </w:r>
+      <w:r>
+        <w:rPr>
+          <w:rStyle w:val="20"/>
+          <w:rFonts w:hint="eastAsia"/>
+          <w:lang/>
+        </w:rPr>
+        <w:t>运行环境</w:t>
+      </w:r>
+      <w:r>
+        <w:rPr>
+          <w:lang/>
+        </w:rPr>
         <w:tab/>
-        <w:t>7</w:t>
+      </w:r>
+      <w:r>
+        <w:rPr>
+          <w:lang/>
+        </w:rPr>
+        <w:fldChar w:fldCharType="begin"/>
+      </w:r>
+      <w:r>
+        <w:rPr>
+          <w:lang/>
+        </w:rPr>
+        <w:instrText xml:space="preserve"> PAGEREF _Toc434320470 \h </w:instrText>
+      </w:r>
+      <w:r>
+        <w:rPr>
+          <w:lang/>
+        </w:rPr>
+        <w:fldChar w:fldCharType="separate"/>
+      </w:r>
+      <w:r>
+        <w:rPr>
+          <w:lang/>
+        </w:rPr>
+        <w:t>2</w:t>
+      </w:r>
+      <w:r>
+        <w:rPr>
+          <w:lang/>
+        </w:rPr>
+        <w:fldChar w:fldCharType="end"/>
+      </w:r>
+      <w:r>
+        <w:rPr>
+          <w:rStyle w:val="20"/>
+          <w:lang/>
+        </w:rPr>
+        <w:fldChar w:fldCharType="end"/>
       </w:r>
     </w:p>
     <w:p>
       <w:pPr>
         <w:pStyle w:val="16"/>
-        <w:spacing w:line="276" w:lineRule="auto" w:after="0"/>
-        <w:ind w:firstLine="0"/>
+        <w:tabs>
+          <w:tab w:val="right" w:leader="dot" w:pos="8296"/>
+        </w:tabs>
+        <w:rPr>
+          <w:rFonts w:ascii="Calibri" w:hAnsi="Calibri"/>
+          <w:szCs w:val="22"/>
+          <w:lang/>
+        </w:rPr>
       </w:pPr>
       <w:r>
         <w:rPr>
-          <w:rFonts w:ascii="Times New Roman" w:hAnsi="Times New Roman" w:eastAsia="宋体"/>
-          <w:sz w:val="21"/>
-        </w:rPr>
-        <w:t>2.3条件与限制</w:t>
+          <w:rStyle w:val="20"/>
+          <w:lang/>
+        </w:rPr>
+        <w:fldChar w:fldCharType="begin"/>
+      </w:r>
+      <w:r>
+        <w:rPr>
+          <w:rStyle w:val="20"/>
+          <w:lang/>
+        </w:rPr>
+        <w:instrText xml:space="preserve"> </w:instrText>
+      </w:r>
+      <w:r>
+        <w:rPr>
+          <w:lang/>
+        </w:rPr>
+        <w:instrText xml:space="preserve">HYPERLINK \l "_Toc434320471"</w:instrText>
+      </w:r>
+      <w:r>
+        <w:rPr>
+          <w:rStyle w:val="20"/>
+          <w:lang/>
+        </w:rPr>
+        <w:instrText xml:space="preserve"> </w:instrText>
+      </w:r>
+      <w:r>
+        <w:rPr>
+          <w:rStyle w:val="20"/>
+          <w:lang/>
+        </w:rPr>
+        <w:fldChar w:fldCharType="separate"/>
+      </w:r>
+      <w:r>
+        <w:rPr>
+          <w:rStyle w:val="20"/>
+          <w:lang/>
+        </w:rPr>
+        <w:t>2.3</w:t>
+      </w:r>
+      <w:r>
+        <w:rPr>
+          <w:rStyle w:val="20"/>
+          <w:rFonts w:hint="eastAsia"/>
+          <w:lang/>
+        </w:rPr>
+        <w:t>条件与限制</w:t>
+      </w:r>
+      <w:r>
+        <w:rPr>
+          <w:lang/>
+        </w:rPr>
         <w:tab/>
-        <w:t>8</w:t>
+      </w:r>
+      <w:r>
+        <w:rPr>
+          <w:lang/>
+        </w:rPr>
+        <w:fldChar w:fldCharType="begin"/>
+      </w:r>
+      <w:r>
+        <w:rPr>
+          <w:lang/>
+        </w:rPr>
+        <w:instrText xml:space="preserve"> PAGEREF _Toc434320471 \h </w:instrText>
+      </w:r>
+      <w:r>
+        <w:rPr>
+          <w:lang/>
+        </w:rPr>
+        <w:fldChar w:fldCharType="separate"/>
+      </w:r>
+      <w:r>
+        <w:rPr>
+          <w:lang/>
+        </w:rPr>
+        <w:t>2</w:t>
+      </w:r>
+      <w:r>
+        <w:rPr>
+          <w:lang/>
+        </w:rPr>
+        <w:fldChar w:fldCharType="end"/>
+      </w:r>
+      <w:r>
+        <w:rPr>
+          <w:rStyle w:val="20"/>
+          <w:lang/>
+        </w:rPr>
+        <w:fldChar w:fldCharType="end"/>
       </w:r>
     </w:p>
     <w:p>
       <w:pPr>
         <w:pStyle w:val="13"/>
-        <w:spacing w:line="276" w:lineRule="auto" w:after="0"/>
-        <w:ind w:firstLine="0"/>
+        <w:tabs>
+          <w:tab w:val="right" w:leader="dot" w:pos="8296"/>
+        </w:tabs>
+        <w:rPr>
+          <w:rFonts w:ascii="Calibri" w:hAnsi="Calibri"/>
+          <w:szCs w:val="22"/>
+          <w:lang/>
+        </w:rPr>
       </w:pPr>
       <w:r>
         <w:rPr>
-          <w:rFonts w:ascii="Times New Roman" w:hAnsi="Times New Roman" w:eastAsia="宋体"/>
-          <w:sz w:val="21"/>
-        </w:rPr>
-        <w:t>3．功能需求</w:t>
+          <w:rStyle w:val="20"/>
+          <w:lang/>
+        </w:rPr>
+        <w:fldChar w:fldCharType="begin"/>
+      </w:r>
+      <w:r>
+        <w:rPr>
+          <w:rStyle w:val="20"/>
+          <w:lang/>
+        </w:rPr>
+        <w:instrText xml:space="preserve"> </w:instrText>
+      </w:r>
+      <w:r>
+        <w:rPr>
+          <w:lang/>
+        </w:rPr>
+        <w:instrText xml:space="preserve">HYPERLINK \l "_Toc434320472"</w:instrText>
+      </w:r>
+      <w:r>
+        <w:rPr>
+          <w:rStyle w:val="20"/>
+          <w:lang/>
+        </w:rPr>
+        <w:instrText xml:space="preserve"> </w:instrText>
+      </w:r>
+      <w:r>
+        <w:rPr>
+          <w:rStyle w:val="20"/>
+          <w:lang/>
+        </w:rPr>
+        <w:fldChar w:fldCharType="separate"/>
+      </w:r>
+      <w:r>
+        <w:rPr>
+          <w:rStyle w:val="20"/>
+          <w:lang/>
+        </w:rPr>
+        <w:t>3</w:t>
+      </w:r>
+      <w:r>
+        <w:rPr>
+          <w:rStyle w:val="20"/>
+          <w:rFonts w:hint="eastAsia"/>
+          <w:lang/>
+        </w:rPr>
+        <w:t>．功能需求</w:t>
+      </w:r>
+      <w:r>
+        <w:rPr>
+          <w:lang/>
+        </w:rPr>
         <w:tab/>
-        <w:t>9</w:t>
+      </w:r>
+      <w:r>
+        <w:rPr>
+          <w:lang/>
+        </w:rPr>
+        <w:fldChar w:fldCharType="begin"/>
+      </w:r>
+      <w:r>
+        <w:rPr>
+          <w:lang/>
+        </w:rPr>
+        <w:instrText xml:space="preserve"> PAGEREF _Toc434320472 \h </w:instrText>
+      </w:r>
+      <w:r>
+        <w:rPr>
+          <w:lang/>
+        </w:rPr>
+        <w:fldChar w:fldCharType="separate"/>
+      </w:r>
+      <w:r>
+        <w:rPr>
+          <w:lang/>
+        </w:rPr>
+        <w:t>2</w:t>
+      </w:r>
+      <w:r>
+        <w:rPr>
+          <w:lang/>
+        </w:rPr>
+        <w:fldChar w:fldCharType="end"/>
+      </w:r>
+      <w:r>
+        <w:rPr>
+          <w:rStyle w:val="20"/>
+          <w:lang/>
+        </w:rPr>
+        <w:fldChar w:fldCharType="end"/>
       </w:r>
     </w:p>
     <w:p>
       <w:pPr>
         <w:pStyle w:val="16"/>
-        <w:spacing w:line="276" w:lineRule="auto" w:after="0"/>
-        <w:ind w:firstLine="0"/>
+        <w:tabs>
+          <w:tab w:val="right" w:leader="dot" w:pos="8296"/>
+        </w:tabs>
+        <w:rPr>
+          <w:rFonts w:ascii="Calibri" w:hAnsi="Calibri"/>
+          <w:szCs w:val="22"/>
+          <w:lang/>
+        </w:rPr>
       </w:pPr>
       <w:r>
         <w:rPr>
-          <w:rFonts w:ascii="Times New Roman" w:hAnsi="Times New Roman" w:eastAsia="宋体"/>
-          <w:sz w:val="21"/>
-        </w:rPr>
-        <w:t>3.1确定执行者</w:t>
+          <w:rStyle w:val="20"/>
+          <w:lang/>
+        </w:rPr>
+        <w:fldChar w:fldCharType="begin"/>
+      </w:r>
+      <w:r>
+        <w:rPr>
+          <w:rStyle w:val="20"/>
+          <w:lang/>
+        </w:rPr>
+        <w:instrText xml:space="preserve"> </w:instrText>
+      </w:r>
+      <w:r>
+        <w:rPr>
+          <w:lang/>
+        </w:rPr>
+        <w:instrText xml:space="preserve">HYPERLINK \l "_Toc434320473"</w:instrText>
+      </w:r>
+      <w:r>
+        <w:rPr>
+          <w:rStyle w:val="20"/>
+          <w:lang/>
+        </w:rPr>
+        <w:instrText xml:space="preserve"> </w:instrText>
+      </w:r>
+      <w:r>
+        <w:rPr>
+          <w:rStyle w:val="20"/>
+          <w:lang/>
+        </w:rPr>
+        <w:fldChar w:fldCharType="separate"/>
+      </w:r>
+      <w:r>
+        <w:rPr>
+          <w:rStyle w:val="20"/>
+          <w:lang/>
+        </w:rPr>
+        <w:t>3.1</w:t>
+      </w:r>
+      <w:r>
+        <w:rPr>
+          <w:rStyle w:val="20"/>
+          <w:rFonts w:hint="eastAsia"/>
+          <w:lang/>
+        </w:rPr>
+        <w:t>确定执行者</w:t>
+      </w:r>
+      <w:r>
+        <w:rPr>
+          <w:lang/>
+        </w:rPr>
         <w:tab/>
-        <w:t>10</w:t>
+      </w:r>
+      <w:r>
+        <w:rPr>
+          <w:lang/>
+        </w:rPr>
+        <w:fldChar w:fldCharType="begin"/>
+      </w:r>
+      <w:r>
+        <w:rPr>
+          <w:lang/>
+        </w:rPr>
+        <w:instrText xml:space="preserve"> PAGEREF _Toc434320473 \h </w:instrText>
+      </w:r>
+      <w:r>
+        <w:rPr>
+          <w:lang/>
+        </w:rPr>
+        <w:fldChar w:fldCharType="separate"/>
+      </w:r>
+      <w:r>
+        <w:rPr>
+          <w:lang/>
+        </w:rPr>
+        <w:t>2</w:t>
+      </w:r>
+      <w:r>
+        <w:rPr>
+          <w:lang/>
+        </w:rPr>
+        <w:fldChar w:fldCharType="end"/>
+      </w:r>
+      <w:r>
+        <w:rPr>
+          <w:rStyle w:val="20"/>
+          <w:lang/>
+        </w:rPr>
+        <w:fldChar w:fldCharType="end"/>
       </w:r>
     </w:p>
     <w:p>
       <w:pPr>
         <w:pStyle w:val="16"/>
-        <w:spacing w:line="276" w:lineRule="auto" w:after="0"/>
-        <w:ind w:firstLine="0"/>
+        <w:tabs>
+          <w:tab w:val="right" w:leader="dot" w:pos="8296"/>
+        </w:tabs>
+        <w:rPr>
+          <w:rFonts w:ascii="Calibri" w:hAnsi="Calibri"/>
+          <w:szCs w:val="22"/>
+          <w:lang/>
+        </w:rPr>
       </w:pPr>
       <w:r>
         <w:rPr>
-          <w:rFonts w:ascii="Times New Roman" w:hAnsi="Times New Roman" w:eastAsia="宋体"/>
-          <w:sz w:val="21"/>
-        </w:rPr>
-        <w:t>3.2确定用例</w:t>
+          <w:rStyle w:val="20"/>
+          <w:lang/>
+        </w:rPr>
+        <w:fldChar w:fldCharType="begin"/>
+      </w:r>
+      <w:r>
+        <w:rPr>
+          <w:rStyle w:val="20"/>
+          <w:lang/>
+        </w:rPr>
+        <w:instrText xml:space="preserve"> </w:instrText>
+      </w:r>
+      <w:r>
+        <w:rPr>
+          <w:lang/>
+        </w:rPr>
+        <w:instrText xml:space="preserve">HYPERLINK \l "_Toc434320474"</w:instrText>
+      </w:r>
+      <w:r>
+        <w:rPr>
+          <w:rStyle w:val="20"/>
+          <w:lang/>
+        </w:rPr>
+        <w:instrText xml:space="preserve"> </w:instrText>
+      </w:r>
+      <w:r>
+        <w:rPr>
+          <w:rStyle w:val="20"/>
+          <w:lang/>
+        </w:rPr>
+        <w:fldChar w:fldCharType="separate"/>
+      </w:r>
+      <w:r>
+        <w:rPr>
+          <w:rStyle w:val="20"/>
+          <w:lang/>
+        </w:rPr>
+        <w:t>3.2</w:t>
+      </w:r>
+      <w:r>
+        <w:rPr>
+          <w:rStyle w:val="20"/>
+          <w:rFonts w:hint="eastAsia"/>
+          <w:lang/>
+        </w:rPr>
+        <w:t>确定用例</w:t>
+      </w:r>
+      <w:r>
+        <w:rPr>
+          <w:lang/>
+        </w:rPr>
         <w:tab/>
-        <w:t>11</w:t>
+      </w:r>
+      <w:r>
+        <w:rPr>
+          <w:lang/>
+        </w:rPr>
+        <w:fldChar w:fldCharType="begin"/>
+      </w:r>
+      <w:r>
+        <w:rPr>
+          <w:lang/>
+        </w:rPr>
+        <w:instrText xml:space="preserve"> PAGEREF _Toc434320474 \h </w:instrText>
+      </w:r>
+      <w:r>
+        <w:rPr>
+          <w:lang/>
+        </w:rPr>
+        <w:fldChar w:fldCharType="separate"/>
+      </w:r>
+      <w:r>
+        <w:rPr>
+          <w:lang/>
+        </w:rPr>
+        <w:t>2</w:t>
+      </w:r>
+      <w:r>
+        <w:rPr>
+          <w:lang/>
+        </w:rPr>
+        <w:fldChar w:fldCharType="end"/>
+      </w:r>
+      <w:r>
+        <w:rPr>
+          <w:rStyle w:val="20"/>
+          <w:lang/>
+        </w:rPr>
+        <w:fldChar w:fldCharType="end"/>
       </w:r>
     </w:p>
     <w:p>
       <w:pPr>
         <w:pStyle w:val="16"/>
-        <w:spacing w:line="276" w:lineRule="auto" w:after="0"/>
-        <w:ind w:firstLine="0"/>
+        <w:tabs>
+          <w:tab w:val="right" w:leader="dot" w:pos="8296"/>
+        </w:tabs>
+        <w:rPr>
+          <w:rFonts w:ascii="Calibri" w:hAnsi="Calibri"/>
+          <w:szCs w:val="22"/>
+          <w:lang/>
+        </w:rPr>
       </w:pPr>
       <w:r>
         <w:rPr>
-          <w:rFonts w:ascii="Times New Roman" w:hAnsi="Times New Roman" w:eastAsia="宋体"/>
-          <w:sz w:val="21"/>
-        </w:rPr>
-        <w:t>3.3编写用例文档</w:t>
+          <w:rStyle w:val="20"/>
+          <w:lang/>
+        </w:rPr>
+        <w:fldChar w:fldCharType="begin"/>
+      </w:r>
+      <w:r>
+        <w:rPr>
+          <w:rStyle w:val="20"/>
+          <w:lang/>
+        </w:rPr>
+        <w:instrText xml:space="preserve"> </w:instrText>
+      </w:r>
+      <w:r>
+        <w:rPr>
+          <w:lang/>
+        </w:rPr>
+        <w:instrText xml:space="preserve">HYPERLINK \l "_Toc434320475"</w:instrText>
+      </w:r>
+      <w:r>
+        <w:rPr>
+          <w:rStyle w:val="20"/>
+          <w:lang/>
+        </w:rPr>
+        <w:instrText xml:space="preserve"> </w:instrText>
+      </w:r>
+      <w:r>
+        <w:rPr>
+          <w:rStyle w:val="20"/>
+          <w:lang/>
+        </w:rPr>
+        <w:fldChar w:fldCharType="separate"/>
+      </w:r>
+      <w:r>
+        <w:rPr>
+          <w:rStyle w:val="20"/>
+          <w:lang/>
+        </w:rPr>
+        <w:t>3.3</w:t>
+      </w:r>
+      <w:r>
+        <w:rPr>
+          <w:rStyle w:val="20"/>
+          <w:rFonts w:hint="eastAsia"/>
+          <w:lang/>
+        </w:rPr>
+        <w:t>编写用例文档</w:t>
+      </w:r>
+      <w:r>
+        <w:rPr>
+          <w:lang/>
+        </w:rPr>
         <w:tab/>
-        <w:t>12</w:t>
+      </w:r>
+      <w:r>
+        <w:rPr>
+          <w:lang/>
+        </w:rPr>
+        <w:fldChar w:fldCharType="begin"/>
+      </w:r>
+      <w:r>
+        <w:rPr>
+          <w:lang/>
+        </w:rPr>
+        <w:instrText xml:space="preserve"> PAGEREF _Toc434320475 \h </w:instrText>
+      </w:r>
+      <w:r>
+        <w:rPr>
+          <w:lang/>
+        </w:rPr>
+        <w:fldChar w:fldCharType="separate"/>
+      </w:r>
+      <w:r>
+        <w:rPr>
+          <w:lang/>
+        </w:rPr>
+        <w:t>3</w:t>
+      </w:r>
+      <w:r>
+        <w:rPr>
+          <w:lang/>
+        </w:rPr>
+        <w:fldChar w:fldCharType="end"/>
+      </w:r>
+      <w:r>
+        <w:rPr>
+          <w:rStyle w:val="20"/>
+          <w:lang/>
+        </w:rPr>
+        <w:fldChar w:fldCharType="end"/>
       </w:r>
     </w:p>
     <w:p>
       <w:pPr>
         <w:pStyle w:val="13"/>
-        <w:spacing w:line="276" w:lineRule="auto" w:after="0"/>
-        <w:ind w:firstLine="0"/>
+        <w:tabs>
+          <w:tab w:val="right" w:leader="dot" w:pos="8296"/>
+        </w:tabs>
+        <w:rPr>
+          <w:rFonts w:ascii="Calibri" w:hAnsi="Calibri"/>
+          <w:szCs w:val="22"/>
+          <w:lang/>
+        </w:rPr>
       </w:pPr>
       <w:r>
         <w:rPr>
-          <w:rFonts w:ascii="Times New Roman" w:hAnsi="Times New Roman" w:eastAsia="宋体"/>
-          <w:sz w:val="21"/>
-        </w:rPr>
-        <w:t>4．非功能需求</w:t>
+          <w:rStyle w:val="20"/>
+          <w:lang/>
+        </w:rPr>
+        <w:fldChar w:fldCharType="begin"/>
+      </w:r>
+      <w:r>
+        <w:rPr>
+          <w:rStyle w:val="20"/>
+          <w:lang/>
+        </w:rPr>
+        <w:instrText xml:space="preserve"> </w:instrText>
+      </w:r>
+      <w:r>
+        <w:rPr>
+          <w:lang/>
+        </w:rPr>
+        <w:instrText xml:space="preserve">HYPERLINK \l "_Toc434320476"</w:instrText>
+      </w:r>
+      <w:r>
+        <w:rPr>
+          <w:rStyle w:val="20"/>
+          <w:lang/>
+        </w:rPr>
+        <w:instrText xml:space="preserve"> </w:instrText>
+      </w:r>
+      <w:r>
+        <w:rPr>
+          <w:rStyle w:val="20"/>
+          <w:lang/>
+        </w:rPr>
+        <w:fldChar w:fldCharType="separate"/>
+      </w:r>
+      <w:r>
+        <w:rPr>
+          <w:rStyle w:val="20"/>
+          <w:lang/>
+        </w:rPr>
+        <w:t>4</w:t>
+      </w:r>
+      <w:r>
+        <w:rPr>
+          <w:rStyle w:val="20"/>
+          <w:rFonts w:hint="eastAsia"/>
+          <w:lang/>
+        </w:rPr>
+        <w:t>．非功能需求</w:t>
+      </w:r>
+      <w:r>
+        <w:rPr>
+          <w:lang/>
+        </w:rPr>
         <w:tab/>
-        <w:t>16</w:t>
+      </w:r>
+      <w:r>
+        <w:rPr>
+          <w:lang/>
+        </w:rPr>
+        <w:fldChar w:fldCharType="begin"/>
+      </w:r>
+      <w:r>
+        <w:rPr>
+          <w:lang/>
+        </w:rPr>
+        <w:instrText xml:space="preserve"> PAGEREF _Toc434320476 \h </w:instrText>
+      </w:r>
+      <w:r>
+        <w:rPr>
+          <w:lang/>
+        </w:rPr>
+        <w:fldChar w:fldCharType="separate"/>
+      </w:r>
+      <w:r>
+        <w:rPr>
+          <w:lang/>
+        </w:rPr>
+        <w:t>3</w:t>
+      </w:r>
+      <w:r>
+        <w:rPr>
+          <w:lang/>
+        </w:rPr>
+        <w:fldChar w:fldCharType="end"/>
+      </w:r>
+      <w:r>
+        <w:rPr>
+          <w:rStyle w:val="20"/>
+          <w:lang/>
+        </w:rPr>
+        <w:fldChar w:fldCharType="end"/>
       </w:r>
     </w:p>
     <w:p>
       <w:pPr>
         <w:pStyle w:val="16"/>
-        <w:spacing w:line="276" w:lineRule="auto" w:after="0"/>
-        <w:ind w:firstLine="0"/>
+        <w:tabs>
+          <w:tab w:val="right" w:leader="dot" w:pos="8296"/>
+        </w:tabs>
+        <w:rPr>
+          <w:rFonts w:ascii="Calibri" w:hAnsi="Calibri"/>
+          <w:szCs w:val="22"/>
+          <w:lang/>
+        </w:rPr>
       </w:pPr>
       <w:r>
         <w:rPr>
-          <w:rFonts w:ascii="Times New Roman" w:hAnsi="Times New Roman" w:eastAsia="宋体"/>
-          <w:sz w:val="21"/>
-        </w:rPr>
-        <w:t>4.1性能需求</w:t>
+          <w:rStyle w:val="20"/>
+          <w:lang/>
+        </w:rPr>
+        <w:fldChar w:fldCharType="begin"/>
+      </w:r>
+      <w:r>
+        <w:rPr>
+          <w:rStyle w:val="20"/>
+          <w:lang/>
+        </w:rPr>
+        <w:instrText xml:space="preserve"> </w:instrText>
+      </w:r>
+      <w:r>
+        <w:rPr>
+          <w:lang/>
+        </w:rPr>
+        <w:instrText xml:space="preserve">HYPERLINK \l "_Toc434320477"</w:instrText>
+      </w:r>
+      <w:r>
+        <w:rPr>
+          <w:rStyle w:val="20"/>
+          <w:lang/>
+        </w:rPr>
+        <w:instrText xml:space="preserve"> </w:instrText>
+      </w:r>
+      <w:r>
+        <w:rPr>
+          <w:rStyle w:val="20"/>
+          <w:lang/>
+        </w:rPr>
+        <w:fldChar w:fldCharType="separate"/>
+      </w:r>
+      <w:r>
+        <w:rPr>
+          <w:rStyle w:val="20"/>
+          <w:lang/>
+        </w:rPr>
+        <w:t>4.1</w:t>
+      </w:r>
+      <w:r>
+        <w:rPr>
+          <w:rStyle w:val="20"/>
+          <w:rFonts w:hint="eastAsia"/>
+          <w:lang/>
+        </w:rPr>
+        <w:t>性能需求</w:t>
+      </w:r>
+      <w:r>
+        <w:rPr>
+          <w:lang/>
+        </w:rPr>
         <w:tab/>
-        <w:t>16</w:t>
+      </w:r>
+      <w:r>
+        <w:rPr>
+          <w:lang/>
+        </w:rPr>
+        <w:fldChar w:fldCharType="begin"/>
+      </w:r>
+      <w:r>
+        <w:rPr>
+          <w:lang/>
+        </w:rPr>
+        <w:instrText xml:space="preserve"> PAGEREF _Toc434320477 \h </w:instrText>
+      </w:r>
+      <w:r>
+        <w:rPr>
+          <w:lang/>
+        </w:rPr>
+        <w:fldChar w:fldCharType="separate"/>
+      </w:r>
+      <w:r>
+        <w:rPr>
+          <w:lang/>
+        </w:rPr>
+        <w:t>3</w:t>
+      </w:r>
+      <w:r>
+        <w:rPr>
+          <w:lang/>
+        </w:rPr>
+        <w:fldChar w:fldCharType="end"/>
+      </w:r>
+      <w:r>
+        <w:rPr>
+          <w:rStyle w:val="20"/>
+          <w:lang/>
+        </w:rPr>
+        <w:fldChar w:fldCharType="end"/>
       </w:r>
     </w:p>
     <w:p>
       <w:pPr>
         <w:pStyle w:val="16"/>
-        <w:spacing w:line="276" w:lineRule="auto" w:after="0"/>
-        <w:ind w:firstLine="0"/>
+        <w:tabs>
+          <w:tab w:val="right" w:leader="dot" w:pos="8296"/>
+        </w:tabs>
+        <w:rPr>
+          <w:rFonts w:ascii="Calibri" w:hAnsi="Calibri"/>
+          <w:szCs w:val="22"/>
+          <w:lang/>
+        </w:rPr>
       </w:pPr>
       <w:r>
         <w:rPr>
-          <w:rFonts w:ascii="Times New Roman" w:hAnsi="Times New Roman" w:eastAsia="宋体"/>
-          <w:sz w:val="21"/>
-        </w:rPr>
-        <w:t>4.2安全需求</w:t>
+          <w:rStyle w:val="20"/>
+          <w:lang/>
+        </w:rPr>
+        <w:fldChar w:fldCharType="begin"/>
+      </w:r>
+      <w:r>
+        <w:rPr>
+          <w:rStyle w:val="20"/>
+          <w:lang/>
+        </w:rPr>
+        <w:instrText xml:space="preserve"> </w:instrText>
+      </w:r>
+      <w:r>
+        <w:rPr>
+          <w:lang/>
+        </w:rPr>
+        <w:instrText xml:space="preserve">HYPERLINK \l "_Toc434320478"</w:instrText>
+      </w:r>
+      <w:r>
+        <w:rPr>
+          <w:rStyle w:val="20"/>
+          <w:lang/>
+        </w:rPr>
+        <w:instrText xml:space="preserve"> </w:instrText>
+      </w:r>
+      <w:r>
+        <w:rPr>
+          <w:rStyle w:val="20"/>
+          <w:lang/>
+        </w:rPr>
+        <w:fldChar w:fldCharType="separate"/>
+      </w:r>
+      <w:r>
+        <w:rPr>
+          <w:rStyle w:val="20"/>
+          <w:lang/>
+        </w:rPr>
+        <w:t>4.2</w:t>
+      </w:r>
+      <w:r>
+        <w:rPr>
+          <w:rStyle w:val="20"/>
+          <w:rFonts w:hint="eastAsia"/>
+          <w:lang/>
+        </w:rPr>
+        <w:t>安全需求</w:t>
+      </w:r>
+      <w:r>
+        <w:rPr>
+          <w:lang/>
+        </w:rPr>
         <w:tab/>
-        <w:t>17</w:t>
+      </w:r>
+      <w:r>
+        <w:rPr>
+          <w:lang/>
+        </w:rPr>
+        <w:fldChar w:fldCharType="begin"/>
+      </w:r>
+      <w:r>
+        <w:rPr>
+          <w:lang/>
+        </w:rPr>
+        <w:instrText xml:space="preserve"> PAGEREF _Toc434320478 \h </w:instrText>
+      </w:r>
+      <w:r>
+        <w:rPr>
+          <w:lang/>
+        </w:rPr>
+        <w:fldChar w:fldCharType="separate"/>
+      </w:r>
+      <w:r>
+        <w:rPr>
+          <w:lang/>
+        </w:rPr>
+        <w:t>3</w:t>
+      </w:r>
+      <w:r>
+        <w:rPr>
+          <w:lang/>
+        </w:rPr>
+        <w:fldChar w:fldCharType="end"/>
+      </w:r>
+      <w:r>
+        <w:rPr>
+          <w:rStyle w:val="20"/>
+          <w:lang/>
+        </w:rPr>
+        <w:fldChar w:fldCharType="end"/>
       </w:r>
     </w:p>
     <w:p>
       <w:pPr>
         <w:pStyle w:val="13"/>
-        <w:spacing w:line="276" w:lineRule="auto" w:after="0"/>
-        <w:ind w:firstLine="0"/>
+        <w:tabs>
+          <w:tab w:val="right" w:leader="dot" w:pos="8296"/>
+        </w:tabs>
+        <w:rPr>
+          <w:rFonts w:ascii="Calibri" w:hAnsi="Calibri"/>
+          <w:szCs w:val="22"/>
+          <w:lang/>
+        </w:rPr>
       </w:pPr>
       <w:r>
         <w:rPr>
-          <w:rFonts w:ascii="Times New Roman" w:hAnsi="Times New Roman" w:eastAsia="宋体"/>
-          <w:sz w:val="21"/>
-        </w:rPr>
-        <w:t>5．故障处理</w:t>
+          <w:rStyle w:val="20"/>
+          <w:lang/>
+        </w:rPr>
+        <w:fldChar w:fldCharType="begin"/>
+      </w:r>
+      <w:r>
+        <w:rPr>
+          <w:rStyle w:val="20"/>
+          <w:lang/>
+        </w:rPr>
+        <w:instrText xml:space="preserve"> </w:instrText>
+      </w:r>
+      <w:r>
+        <w:rPr>
+          <w:lang/>
+        </w:rPr>
+        <w:instrText xml:space="preserve">HYPERLINK \l "_Toc434320479"</w:instrText>
+      </w:r>
+      <w:r>
+        <w:rPr>
+          <w:rStyle w:val="20"/>
+          <w:lang/>
+        </w:rPr>
+        <w:instrText xml:space="preserve"> </w:instrText>
+      </w:r>
+      <w:r>
+        <w:rPr>
+          <w:rStyle w:val="20"/>
+          <w:lang/>
+        </w:rPr>
+        <w:fldChar w:fldCharType="separate"/>
+      </w:r>
+      <w:r>
+        <w:rPr>
+          <w:rStyle w:val="20"/>
+          <w:lang/>
+        </w:rPr>
+        <w:t>5</w:t>
+      </w:r>
+      <w:r>
+        <w:rPr>
+          <w:rStyle w:val="20"/>
+          <w:rFonts w:hint="eastAsia"/>
+          <w:lang/>
+        </w:rPr>
+        <w:t>．故障处理</w:t>
+      </w:r>
+      <w:r>
+        <w:rPr>
+          <w:lang/>
+        </w:rPr>
         <w:tab/>
-        <w:t>18</w:t>
+      </w:r>
+      <w:r>
+        <w:rPr>
+          <w:lang/>
+        </w:rPr>
+        <w:fldChar w:fldCharType="begin"/>
+      </w:r>
+      <w:r>
+        <w:rPr>
+          <w:lang/>
+        </w:rPr>
+        <w:instrText xml:space="preserve"> PAGEREF _Toc434320479 \h </w:instrText>
+      </w:r>
+      <w:r>
+        <w:rPr>
+          <w:lang/>
+        </w:rPr>
+        <w:fldChar w:fldCharType="separate"/>
+      </w:r>
+      <w:r>
+        <w:rPr>
+          <w:lang/>
+        </w:rPr>
+        <w:t>3</w:t>
+      </w:r>
+      <w:r>
+        <w:rPr>
+          <w:lang/>
+        </w:rPr>
+        <w:fldChar w:fldCharType="end"/>
+      </w:r>
+      <w:r>
+        <w:rPr>
+          <w:rStyle w:val="20"/>
+          <w:lang/>
+        </w:rPr>
+        <w:fldChar w:fldCharType="end"/>
       </w:r>
     </w:p>
     <w:p>
       <w:pPr>
         <w:pStyle w:val="13"/>
-        <w:spacing w:line="276" w:lineRule="auto" w:after="0"/>
-        <w:ind w:firstLine="0"/>
+        <w:tabs>
+          <w:tab w:val="right" w:leader="dot" w:pos="8296"/>
+        </w:tabs>
+        <w:rPr>
+          <w:rFonts w:ascii="Calibri" w:hAnsi="Calibri"/>
+          <w:szCs w:val="22"/>
+          <w:lang/>
+        </w:rPr>
       </w:pPr>
       <w:r>
         <w:rPr>
-          <w:rFonts w:ascii="Times New Roman" w:hAnsi="Times New Roman" w:eastAsia="宋体"/>
-          <w:sz w:val="21"/>
-        </w:rPr>
-        <w:t>6．其它需求</w:t>
+          <w:rStyle w:val="20"/>
+          <w:lang/>
+        </w:rPr>
+        <w:fldChar w:fldCharType="begin"/>
+      </w:r>
+      <w:r>
+        <w:rPr>
+          <w:rStyle w:val="20"/>
+          <w:lang/>
+        </w:rPr>
+        <w:instrText xml:space="preserve"> </w:instrText>
+      </w:r>
+      <w:r>
+        <w:rPr>
+          <w:lang/>
+        </w:rPr>
+        <w:instrText xml:space="preserve">HYPERLINK \l "_Toc434320480"</w:instrText>
+      </w:r>
+      <w:r>
+        <w:rPr>
+          <w:rStyle w:val="20"/>
+          <w:lang/>
+        </w:rPr>
+        <w:instrText xml:space="preserve"> </w:instrText>
+      </w:r>
+      <w:r>
+        <w:rPr>
+          <w:rStyle w:val="20"/>
+          <w:lang/>
+        </w:rPr>
+        <w:fldChar w:fldCharType="separate"/>
+      </w:r>
+      <w:r>
+        <w:rPr>
+          <w:rStyle w:val="20"/>
+          <w:lang/>
+        </w:rPr>
+        <w:t>6</w:t>
+      </w:r>
+      <w:r>
+        <w:rPr>
+          <w:rStyle w:val="20"/>
+          <w:rFonts w:hint="eastAsia"/>
+          <w:lang/>
+        </w:rPr>
+        <w:t>．其它需求</w:t>
+      </w:r>
+      <w:r>
+        <w:rPr>
+          <w:lang/>
+        </w:rPr>
         <w:tab/>
-        <w:t>20</w:t>
+      </w:r>
+      <w:r>
+        <w:rPr>
+          <w:lang/>
+        </w:rPr>
+        <w:fldChar w:fldCharType="begin"/>
+      </w:r>
+      <w:r>
+        <w:rPr>
+          <w:lang/>
+        </w:rPr>
+        <w:instrText xml:space="preserve"> PAGEREF _Toc434320480 \h </w:instrText>
+      </w:r>
+      <w:r>
+        <w:rPr>
+          <w:lang/>
+        </w:rPr>
+        <w:fldChar w:fldCharType="separate"/>
+      </w:r>
+      <w:r>
+        <w:rPr>
+          <w:lang/>
+        </w:rPr>
+        <w:t>3</w:t>
+      </w:r>
+      <w:r>
+        <w:rPr>
+          <w:lang/>
+        </w:rPr>
+        <w:fldChar w:fldCharType="end"/>
+      </w:r>
+      <w:r>
+        <w:rPr>
+          <w:rStyle w:val="20"/>
+          <w:lang/>
+        </w:rPr>
+        <w:fldChar w:fldCharType="end"/>
       </w:r>
     </w:p>
     <w:p>
       <w:pPr>
-        <w:ind w:firstLine="0"/>
+        <w:rPr>
+          <w:rFonts w:hint="eastAsia"/>
+        </w:rPr>
       </w:pPr>
       <w:r>
-        <w:br w:type="page"/>
-      </w:r>
+        <w:fldChar w:fldCharType="end"/>
+      </w:r>
+    </w:p>
+    <w:p>
+      <w:pPr>
+        <w:rPr>
+          <w:rFonts w:hint="eastAsia"/>
+        </w:rPr>
+      </w:pPr>
     </w:p>
     <w:p>
       <w:pPr>
@@ -352,7 +1979,7 @@
           <w:rFonts w:ascii="Times New Roman" w:hAnsi="Times New Roman" w:eastAsia="宋体"/>
           <w:sz w:val="21"/>
         </w:rPr>
-        <w:t>本文档用于完整说明 EvolveFlow 智能日程助理的需求范围，明确系统应向用户提供的功能、性能、安全、可用性、可维护性和故障处理能力。需求规格说明书是后续系统设计、编码实现、测试验收和课程评审的依据，因此所有需求均尽量以可观察、可执行、可验证的方式描述。</w:t>
+        <w:t>本说明书用于完整说明 EvolveFlow 智能日程助理的需求范围，明确系统应向用户提供的功能、性能、安全、可用性、可维护性和故障处理能力。需求规格说明书是后续系统设计、编码实现、测试验收和项目验收的依据，所有需求均以可观察、可执行、可验证的方式描述。</w:t>
       </w:r>
     </w:p>
     <w:p>
@@ -365,7 +1992,7 @@
           <w:rFonts w:ascii="Times New Roman" w:hAnsi="Times New Roman" w:eastAsia="宋体"/>
           <w:sz w:val="21"/>
         </w:rPr>
-        <w:t>本文档的读者包括项目组成员、系统设计人员、开发人员、测试人员和评审人员。设计人员可据此划分模块和接口，开发人员可据此实现功能，测试人员可据此编写测试用例，评审人员可据此判断项目是否真正围绕用户问题形成完整产品。</w:t>
+        <w:t>本说明书供需求分析、系统设计、开发实现和测试验收环节使用。设计人员可据此划分模块和接口，开发人员可据此实现功能，测试人员可据此编写测试用例，验收人员可据此判断系统是否真正围绕用户问题形成完整产品。</w:t>
       </w:r>
     </w:p>
     <w:p>
@@ -378,7 +2005,7 @@
           <w:rFonts w:ascii="Times New Roman" w:hAnsi="Times New Roman" w:eastAsia="宋体"/>
           <w:sz w:val="21"/>
         </w:rPr>
-        <w:t>项目组采用统一分工口径：孟天赐（2410250732，队长）负责总体统筹和最终验收，杨瑞熙（2410250115）负责需求与用例，王研博（2410250646）负责存储、领域服务和能力注册，姚玮（2410250848）负责 AI runtime 与工具调用闭环，王雅娴（2410250575）负责桌面前端交互，冯留杨（2410250311）负责 Tauri 桌面后端与安装交付，李思晴（2410250609）负责测试计划和缺陷闭环，闫艺馨（2410250846）负责课程文档、图表和视觉质量。四份文档中涉及人员责任、测试执行和交付验收时均采用这一套姓名与学号口径。</w:t>
+        <w:t>项目组采用统一分工：孟天赐（2410250732，队长）负责总体统筹和最终验收，杨瑞熙（2410250115）负责需求与用例，王研博（2410250646）负责存储、领域服务和能力注册，姚玮（2410250848）负责 AI runtime 与工具调用闭环，王雅娴（2410250575）负责桌面前端交互，冯留杨（2410250311）负责 Tauri 桌面后端与安装交付，李思晴（2410250609）负责测试计划和缺陷闭环，闫艺馨（2410250846）负责项目文档、图表和版式质量。</w:t>
       </w:r>
     </w:p>
     <w:p>
@@ -391,7 +2018,7 @@
           <w:rFonts w:ascii="Times New Roman" w:hAnsi="Times New Roman" w:eastAsia="宋体"/>
           <w:sz w:val="21"/>
         </w:rPr>
-        <w:t>需求分析工作由杨瑞熙（2410250115）主责，重点把用户场景、用例、功能需求和验收条件写清楚；孟天赐（2410250732，队长）负责确认需求边界和最终优先级，李思晴（2410250609）负责把需求转化为可执行测试口径，王研博（2410250646）、姚玮（2410250848）、王雅娴（2410250575）和冯留杨（2410250311）分别从实现可行性角度复核相关需求。</w:t>
+        <w:t>需求分析由杨瑞熙（2410250115）主责，主要负责用户场景、用例、功能需求和验收条件的整理；孟天赐（2410250732，队长）负责确认需求边界和优先级，李思晴（2410250609）负责将需求转化为可验证的测试口径，王研博（2410250646）、姚玮（2410250848）、王雅娴（2410250575）和冯留杨（2410250311）分别从实现可行性角度复核相关需求。</w:t>
       </w:r>
     </w:p>
     <w:p>
@@ -404,7 +2031,7 @@
           <w:rFonts w:ascii="Times New Roman" w:hAnsi="Times New Roman" w:eastAsia="宋体"/>
           <w:sz w:val="21"/>
         </w:rPr>
-        <w:t>本说明书尤其强调 AI agent 功能的真实性。系统允许用户用自然语言表达计划、查询、调整和总结需求，但模型只能通过已注册能力读取或变更数据；所有变更都要经过本地校验、审计和撤销机制。需求层面不接受用关键词规则、固定回复或静态建议替代模型工具调用闭环。</w:t>
+        <w:t>本说明书尤其强调 AI agent 功能的真实性。系统允许用户用自然语言表达计划、查询、调整和总结需求，但模型只能通过已注册能力读取或变更数据；所有变更都要经过本地校验、审计和撤销机制。需求层面不接受用固定规则、预写回复或静态建议替代模型工具调用闭环。</w:t>
       </w:r>
     </w:p>
     <w:p>
@@ -456,7 +2083,7 @@
           <w:rFonts w:ascii="Times New Roman" w:hAnsi="Times New Roman" w:eastAsia="宋体"/>
           <w:sz w:val="21"/>
         </w:rPr>
-        <w:t>从课程实践角度看，本项目适合作为软件工程综合项目，因为它包含需求建模、对象建模、数据结构、动态行为、用户界面、测试报告和发布交付等完整环节。需求规格不仅描述理想功能，也描述边界条件、失败场景和验收口径。</w:t>
+        <w:t>本项目覆盖需求建模、对象建模、数据结构、动态行为、用户界面、测试验证和发布交付等完整软件工程环节。需求规格不仅描述目标功能，也明确边界条件、失败场景和验收口径。</w:t>
       </w:r>
     </w:p>
     <w:p>
@@ -1202,7 +2829,7 @@
           <w:rFonts w:ascii="Times New Roman" w:hAnsi="Times New Roman" w:eastAsia="宋体"/>
           <w:sz w:val="21"/>
         </w:rPr>
-        <w:t>本说明书参考需求工程标准、软件工程教材和相关技术官方文档，重点用于确定需求表达方式、功能与非功能需求分类、需求可追踪关系和验收验证方式。项目内部计划和设计文档将在后续章节作为开发产物相互引用，但本节列出的参考资料以真实公开资料为主。</w:t>
+        <w:t>本说明书参考需求工程标准、软件工程教材和相关技术官方文档，用于确定需求表达方式、功能与非功能需求分类、需求可追踪关系和验收验证方式。项目计划、系统设计和测试材料作为配套工程文档，与本说明书共同支撑后续开发和验收。</w:t>
       </w:r>
     </w:p>
     <w:p>
@@ -2749,7 +4376,7 @@
           <w:rFonts w:ascii="Times New Roman" w:hAnsi="Times New Roman" w:eastAsia="宋体"/>
           <w:sz w:val="21"/>
         </w:rPr>
-        <w:t>功能目标包括任务管理、日历事件管理、智能排程、提醒管理、每日总结、偏好管理、AI 对话、长期洞察、历史记录、撤销、备份恢复、设置和桌面通知。非功能目标包括本地数据安全、模型失败可降级、页面操作流畅、核心查询响应及时、数据迁移可靠、安装包可交付、文档与代码一致。</w:t>
+        <w:t>功能目标包括任务管理、日历事件管理、智能排程、提醒管理、每日总结、偏好管理、AI 对话、长期洞察、历史记录、撤销、备份恢复、设置和桌面通知。非功能目标包括本地数据安全、模型失败可降级、页面操作流畅、核心查询响应及时、数据迁移可靠、安装包可交付、工程实现与需求保持一致。</w:t>
       </w:r>
     </w:p>
     <w:p>
@@ -3432,17 +5059,8 @@
             </w:tcBorders>
           </w:tcPr>
           <w:p>
-            <w:pPr>
-              <w:spacing w:line="269" w:lineRule="auto"/>
-              <w:ind w:firstLine="0"/>
-              <w:jc w:val="left"/>
-            </w:pPr>
-            <w:r>
-              <w:rPr>
-                <w:rFonts w:ascii="Times New Roman" w:hAnsi="Times New Roman" w:eastAsia="宋体"/>
-                <w:sz w:val="17"/>
-              </w:rPr>
-              <w:t>课程文档充实、规范、结构与模板一致</w:t>
+            <w:r>
+              <w:t>交付文档充实、规范、结构与模板一致</w:t>
             </w:r>
           </w:p>
         </w:tc>
@@ -3464,17 +5082,8 @@
             </w:tcBorders>
           </w:tcPr>
           <w:p>
-            <w:pPr>
-              <w:spacing w:line="269" w:lineRule="auto"/>
-              <w:ind w:firstLine="0"/>
-              <w:jc w:val="left"/>
-            </w:pPr>
-            <w:r>
-              <w:rPr>
-                <w:rFonts w:ascii="Times New Roman" w:hAnsi="Times New Roman" w:eastAsia="宋体"/>
-                <w:sz w:val="17"/>
-              </w:rPr>
-              <w:t>四份最终 DOCX 均通过页面检查</w:t>
+            <w:r>
+              <w:t>四份正式 DOCX 均通过页面检查</w:t>
             </w:r>
           </w:p>
         </w:tc>
@@ -5864,7 +7473,7 @@
           <w:rFonts w:ascii="Times New Roman" w:hAnsi="Times New Roman" w:eastAsia="宋体"/>
           <w:sz w:val="21"/>
         </w:rPr>
-        <w:t>系统需要支持多入口一致性。用户可以通过页面按钮创建任务，也可以让 AI 创建任务，还可以在 CLI 或测试中调用能力；这些入口最终都应进入 task.create 或相关 capability，不能让前端单独维护一套业务逻辑，也不能让 AI 使用另一套隐藏规则。</w:t>
+        <w:t>系统需要支持多入口一致性。用户可以通过页面按钮创建任务，也可以让 AI 创建任务，还可以通过系统内部能力接口完成同类操作；这些入口最终都应进入 task.create 或相关 capability，避免不同入口产生不一致的数据规则。</w:t>
       </w:r>
     </w:p>
     <w:p>
@@ -12371,7 +13980,7 @@
           <w:rFonts w:ascii="Times New Roman" w:hAnsi="Times New Roman" w:eastAsia="宋体"/>
           <w:sz w:val="21"/>
         </w:rPr>
-        <w:t>AI agent 相关用例需要补充前置条件和失败处理。用户提出自然语言请求前，系统需要有可用会话、模型配置或明确离线状态；模型请求发出后，系统要显示流式进度；模型提出工具调用后，能力层必须校验输入；工具执行成功后，结果回到模型并生成用户可读解释；任一步失败都要返回可理解错误。</w:t>
+        <w:t>AI agent 相关用例应明确前置条件和失败处理。用户提出自然语言请求前，系统需要具备可用会话、模型配置或明确离线状态；模型请求发出后，系统要显示流式进度；模型提出工具调用后，能力层必须校验输入；工具执行成功后，结果回到模型并生成用户可读解释；任一步失败都要返回可理解错误。</w:t>
       </w:r>
     </w:p>
     <w:p>
@@ -19093,7 +20702,7 @@
           <w:rFonts w:ascii="Times New Roman" w:hAnsi="Times New Roman" w:eastAsia="宋体"/>
           <w:sz w:val="21"/>
         </w:rPr>
-        <w:t>文档需求要求课程提交材料与实际工程一致，且不得暴露密钥、内部调试文本或私人数据。文档中对 AI、数据库、测试结果和安装交付的描述应能被代码、命令或视觉检查证据支持。最终 DOCX 应沿用模板结构，表格采用三线表，图文密度适中，页面整洁。</w:t>
+        <w:t>文档与交付材料应与实际工程保持一致，且不得暴露密钥、内部调试文本或私人数据。文档中对 AI、数据库、测试结果和安装交付的描述应能被代码、命令或视觉检查证据支持。交付材料应结构清晰、图表规范、页面整洁，便于阅读和验收。</w:t>
       </w:r>
     </w:p>
     <w:p>
@@ -19707,7 +21316,9 @@
                 <w:rFonts w:ascii="Times New Roman" w:hAnsi="Times New Roman" w:eastAsia="宋体"/>
                 <w:sz w:val="17"/>
               </w:rPr>
-              <w:t>最终提交前敏感信息检查</w:t>
+            </w:r>
+            <w:r>
+              <w:t>交付前敏感信息检查</w:t>
             </w:r>
           </w:p>
         </w:tc>
@@ -19763,17 +21374,8 @@
             </w:tcBorders>
           </w:tcPr>
           <w:p>
-            <w:pPr>
-              <w:spacing w:line="269" w:lineRule="auto"/>
-              <w:ind w:firstLine="0"/>
-              <w:jc w:val="left"/>
-            </w:pPr>
-            <w:r>
-              <w:rPr>
-                <w:rFonts w:ascii="Times New Roman" w:hAnsi="Times New Roman" w:eastAsia="宋体"/>
-                <w:sz w:val="17"/>
-              </w:rPr>
-              <w:t>课程文档充分、规范、结构一致、视觉良好</w:t>
+            <w:r>
+              <w:t>交付文档充分、规范、结构一致、版式良好</w:t>
             </w:r>
           </w:p>
         </w:tc>
@@ -19795,17 +21397,8 @@
             </w:tcBorders>
           </w:tcPr>
           <w:p>
-            <w:pPr>
-              <w:spacing w:line="269" w:lineRule="auto"/>
-              <w:ind w:firstLine="0"/>
-              <w:jc w:val="left"/>
-            </w:pPr>
-            <w:r>
-              <w:rPr>
-                <w:rFonts w:ascii="Times New Roman" w:hAnsi="Times New Roman" w:eastAsia="宋体"/>
-                <w:sz w:val="17"/>
-              </w:rPr>
-              <w:t>DOCX 渲染抽查和页数检查</w:t>
+            <w:r>
+              <w:t>DOCX 页面抽查和结构检查</w:t>
             </w:r>
           </w:p>
         </w:tc>
@@ -19853,7 +21446,7 @@
           <w:rFonts w:ascii="Times New Roman" w:hAnsi="Times New Roman" w:eastAsia="宋体"/>
           <w:sz w:val="21"/>
         </w:rPr>
-        <w:t>数据导出需求要求用户能够以 JSON 或 Markdown 方式导出关键数据，方便备份之外的查看、迁移和课程演示。导出不应包含完整密钥或不必要的内部日志，若包含动作历史，应让用户知道其中可能有个人任务内容。</w:t>
+        <w:t>数据导出需求要求用户能够以 JSON 或 Markdown 方式导出关键数据，方便备份之外的查看、迁移和项目展示。导出不应包含完整密钥或不必要的内部日志；若包含动作历史，应提示用户其中可能包含个人任务内容。</w:t>
       </w:r>
     </w:p>
     <w:p>
@@ -21231,7 +22824,6 @@
       <w:jc w:val="both"/>
     </w:pPr>
     <w:rPr>
-      <w:rFonts w:ascii="Times New Roman" w:hAnsi="Times New Roman" w:eastAsia="宋体"/>
       <w:kern w:val="2"/>
       <w:sz w:val="21"/>
       <w:szCs w:val="24"/>
@@ -21251,7 +22843,6 @@
       <w:outlineLvl w:val="0"/>
     </w:pPr>
     <w:rPr>
-      <w:rFonts w:ascii="Times New Roman" w:hAnsi="Times New Roman" w:eastAsia="黑体"/>
       <w:b/>
       <w:bCs/>
       <w:kern w:val="44"/>
@@ -21272,7 +22863,7 @@
       <w:outlineLvl w:val="1"/>
     </w:pPr>
     <w:rPr>
-      <w:rFonts w:ascii="Times New Roman" w:hAnsi="Times New Roman" w:eastAsia="黑体"/>
+      <w:rFonts w:ascii="Arial" w:hAnsi="Arial" w:eastAsia="黑体"/>
       <w:b/>
       <w:bCs/>
       <w:sz w:val="32"/>
@@ -21292,7 +22883,6 @@
       <w:outlineLvl w:val="2"/>
     </w:pPr>
     <w:rPr>
-      <w:rFonts w:ascii="Times New Roman" w:hAnsi="Times New Roman" w:eastAsia="黑体"/>
       <w:b/>
       <w:bCs/>
       <w:sz w:val="32"/>

</xml_diff>